<commit_message>
Add document ownership (Product Owner / Product & Tech-Security Head) to compliance docs
- Inject accountable-roles block into Docs 01-04, 07-10 (Markdown + regenerated Word):
  Product Owner: Sridhar Muppidi; Product Head: Sachin Tulla; Technical & Security Head: Sachin Tulla.
- Annotate the three spreadsheets (05 SoA, 06 Evidence Pack, 07 tracker) with the same ownership line.
- Word-only document set (per request).

Co-Authored-By: Claude Opus 4.8 <noreply@anthropic.com>
</commit_message>
<xml_diff>
--- a/docs/compliance/01-Product-Requirements-Document.docx
+++ b/docs/compliance/01-Product-Requirements-Document.docx
@@ -35,6 +35,69 @@
       </w:pPr>
       <w:r>
         <w:t xml:space="preserve">SwiftLoan — Product Requirements Document (PRD)</w:t>
+      </w:r>
+    </w:p>
+    <w:p>
+      <w:pPr>
+        <w:pStyle w:val="BlockText"/>
+      </w:pPr>
+      <w:r>
+        <w:rPr>
+          <w:b/>
+          <w:bCs/>
+        </w:rPr>
+        <w:t xml:space="preserve">Document ownership &amp; accountable roles</w:t>
+      </w:r>
+      <w:r>
+        <w:t xml:space="preserve"> </w:t>
+      </w:r>
+      <w:r>
+        <w:t xml:space="preserve">— Product Owner:</w:t>
+      </w:r>
+      <w:r>
+        <w:t xml:space="preserve"> </w:t>
+      </w:r>
+      <w:r>
+        <w:rPr>
+          <w:b/>
+          <w:bCs/>
+        </w:rPr>
+        <w:t xml:space="preserve">Sridhar Muppidi</w:t>
+      </w:r>
+      <w:r>
+        <w:t xml:space="preserve"> </w:t>
+      </w:r>
+      <w:r>
+        <w:t xml:space="preserve">· Product Head:</w:t>
+      </w:r>
+      <w:r>
+        <w:t xml:space="preserve"> </w:t>
+      </w:r>
+      <w:r>
+        <w:rPr>
+          <w:b/>
+          <w:bCs/>
+        </w:rPr>
+        <w:t xml:space="preserve">Sachin Tulla</w:t>
+      </w:r>
+      <w:r>
+        <w:t xml:space="preserve"> </w:t>
+      </w:r>
+      <w:r>
+        <w:t xml:space="preserve">· Technical &amp; Security Head:</w:t>
+      </w:r>
+      <w:r>
+        <w:t xml:space="preserve"> </w:t>
+      </w:r>
+      <w:r>
+        <w:rPr>
+          <w:b/>
+          <w:bCs/>
+        </w:rPr>
+        <w:t xml:space="preserve">Sachin Tulla</w:t>
+      </w:r>
+      <w:r>
+        <w:t xml:space="preserve">.</w:t>
       </w:r>
     </w:p>
     <w:p>

</xml_diff>

<commit_message>
Correct document ownership roles across compliance docs
Roles now: Product Owner: Sridhar Muppidi; Product Head: Sachin Tulla;
Technical Head: Sachin Tulla; Head of Engineering: Hari PS; Security Head: Anil M.
Applied to Docs 01-04, 07-10 (Markdown + Word) and the three spreadsheets (05,06,07).

Co-Authored-By: Claude Opus 4.8 <noreply@anthropic.com>
</commit_message>
<xml_diff>
--- a/docs/compliance/01-Product-Requirements-Document.docx
+++ b/docs/compliance/01-Product-Requirements-Document.docx
@@ -84,7 +84,7 @@
         <w:t xml:space="preserve"> </w:t>
       </w:r>
       <w:r>
-        <w:t xml:space="preserve">· Technical &amp; Security Head:</w:t>
+        <w:t xml:space="preserve">· Technical Head:</w:t>
       </w:r>
       <w:r>
         <w:t xml:space="preserve"> </w:t>
@@ -95,6 +95,38 @@
           <w:bCs/>
         </w:rPr>
         <w:t xml:space="preserve">Sachin Tulla</w:t>
+      </w:r>
+      <w:r>
+        <w:t xml:space="preserve"> </w:t>
+      </w:r>
+      <w:r>
+        <w:t xml:space="preserve">· Head of Engineering:</w:t>
+      </w:r>
+      <w:r>
+        <w:t xml:space="preserve"> </w:t>
+      </w:r>
+      <w:r>
+        <w:rPr>
+          <w:b/>
+          <w:bCs/>
+        </w:rPr>
+        <w:t xml:space="preserve">Hari PS</w:t>
+      </w:r>
+      <w:r>
+        <w:t xml:space="preserve"> </w:t>
+      </w:r>
+      <w:r>
+        <w:t xml:space="preserve">· Security Head:</w:t>
+      </w:r>
+      <w:r>
+        <w:t xml:space="preserve"> </w:t>
+      </w:r>
+      <w:r>
+        <w:rPr>
+          <w:b/>
+          <w:bCs/>
+        </w:rPr>
+        <w:t xml:space="preserve">Anil M</w:t>
       </w:r>
       <w:r>
         <w:t xml:space="preserve">.</w:t>

</xml_diff>

<commit_message>
Combine Product/Technical Head role and remove Release Manager role title
- Ownership now: Product Owner: Sridhar Muppidi; Product / Technical Head:
  Sachin Tulla; Head of Engineering: Hari PS; Security Head: Anil M.
- Replace the "Release Manager" role title with "Head of Engineering" across docs
  (kept the technical term "secrets manager").
- Applied to Docs 01-04, 07-10 (Markdown + Word) and spreadsheets 05/06/07.

Co-Authored-By: Claude Opus 4.8 <noreply@anthropic.com>
</commit_message>
<xml_diff>
--- a/docs/compliance/01-Product-Requirements-Document.docx
+++ b/docs/compliance/01-Product-Requirements-Document.docx
@@ -68,23 +68,7 @@
         <w:t xml:space="preserve"> </w:t>
       </w:r>
       <w:r>
-        <w:t xml:space="preserve">· Product Head:</w:t>
-      </w:r>
-      <w:r>
-        <w:t xml:space="preserve"> </w:t>
-      </w:r>
-      <w:r>
-        <w:rPr>
-          <w:b/>
-          <w:bCs/>
-        </w:rPr>
-        <w:t xml:space="preserve">Sachin Tulla</w:t>
-      </w:r>
-      <w:r>
-        <w:t xml:space="preserve"> </w:t>
-      </w:r>
-      <w:r>
-        <w:t xml:space="preserve">· Technical Head:</w:t>
+        <w:t xml:space="preserve">· Product / Technical Head:</w:t>
       </w:r>
       <w:r>
         <w:t xml:space="preserve"> </w:t>
@@ -1196,7 +1180,7 @@
               <w:pStyle w:val="Compact"/>
             </w:pPr>
             <w:r>
-              <w:t xml:space="preserve">Product managers</w:t>
+              <w:t xml:space="preserve">Product / Technical Head</w:t>
             </w:r>
           </w:p>
         </w:tc>

</xml_diff>